<commit_message>
Actualización de obligatoriedad de fotos.
</commit_message>
<xml_diff>
--- a/docs/MANUAL_ESTUDIANTE.docx
+++ b/docs/MANUAL_ESTUDIANTE.docx
@@ -781,7 +781,7 @@
           <w:sz w:val="22"/>
           <w:szCs w:val="22"/>
         </w:rPr>
-        <w:t xml:space="preserve">**La foto es obligatoria.** Sin ella, el código no funcionará.</w:t>
+        <w:t xml:space="preserve">**La foto es opcional.** Si no tienes cámara o permisos, puedes escribir directamente el código.</w:t>
       </w:r>
     </w:p>
     <w:p>
@@ -1666,10 +1666,10 @@
           <w:b/>
           <w:bCs/>
         </w:rPr>
-        <w:t xml:space="preserve">La foto es obligatoria.</w:t>
-      </w:r>
-      <w:r>
-        <w:t xml:space="preserve"> El código nunca funciona sin evidencia.</w:t>
+        <w:t xml:space="preserve">La foto es opcional.</w:t>
+      </w:r>
+      <w:r>
+        <w:t xml:space="preserve"> Te ayuda como evidencia, pero si no tienes cámara puedes escribir el código directamente.</w:t>
       </w:r>
     </w:p>
     <w:p>

</xml_diff>